<commit_message>
Latest resuyme experience updates synced for all formats.
</commit_message>
<xml_diff>
--- a/download/JJ_BADENHORST_CV_2026_with_photo.docx
+++ b/download/JJ_BADENHORST_CV_2026_with_photo.docx
@@ -1747,6 +1747,244 @@
         <w:rPr>
           <w:b w:val="1"/>
           <w:bCs w:val="1"/>
+        </w:rPr>
+      </w:pPr>
+      <w:r>
+        <w:rPr>
+          <w:rtl w:val="0"/>
+        </w:rPr>
+      </w:r>
+    </w:p>
+    <w:p>
+      <w:pPr>
+        <w:pBdr>
+          <w:top w:color="000000" w:space="0" w:sz="0" w:val="none"/>
+          <w:bottom w:color="000000" w:space="0" w:sz="0" w:val="none"/>
+          <w:between w:color="000000" w:space="0" w:sz="0" w:val="none"/>
+        </w:pBdr>
+        <w:shd w:fill="ffffff" w:val="clear"/>
+        <w:spacing w:line="240" w:lineRule="auto"/>
+        <w:rPr>
+          <w:b w:val="1"/>
+          <w:bCs w:val="1"/>
+        </w:rPr>
+      </w:pPr>
+      <w:r>
+        <w:rPr>
+          <w:b w:val="1"/>
+          <w:bCs w:val="1"/>
+          <w:rtl w:val="0"/>
+        </w:rPr>
+        <w:t xml:space="preserve">Test Engineer </w:t>
+      </w:r>
+    </w:p>
+    <w:p>
+      <w:pPr>
+        <w:pBdr>
+          <w:top w:color="000000" w:space="0" w:sz="0" w:val="none"/>
+          <w:bottom w:color="000000" w:space="0" w:sz="0" w:val="none"/>
+          <w:between w:color="000000" w:space="0" w:sz="0" w:val="none"/>
+        </w:pBdr>
+        <w:shd w:fill="ffffff" w:val="clear"/>
+        <w:spacing w:line="240" w:lineRule="auto"/>
+        <w:rPr>
+          <w:b w:val="1"/>
+          <w:bCs w:val="1"/>
+          <w:color w:val="4a86e8"/>
+        </w:rPr>
+      </w:pPr>
+      <w:r>
+        <w:rPr>
+          <w:b w:val="1"/>
+          <w:bCs w:val="1"/>
+          <w:color w:val="4a86e8"/>
+          <w:rtl w:val="0"/>
+        </w:rPr>
+        <w:t xml:space="preserve">Breakpoint | Consulting</w:t>
+      </w:r>
+    </w:p>
+    <w:p>
+      <w:pPr>
+        <w:pBdr>
+          <w:top w:color="000000" w:space="0" w:sz="0" w:val="none"/>
+          <w:bottom w:color="000000" w:space="0" w:sz="0" w:val="none"/>
+          <w:between w:color="000000" w:space="0" w:sz="0" w:val="none"/>
+        </w:pBdr>
+        <w:shd w:fill="ffffff" w:val="clear"/>
+        <w:spacing w:line="240" w:lineRule="auto"/>
+        <w:rPr>
+          <w:sz w:val="20"/>
+          <w:szCs w:val="20"/>
+        </w:rPr>
+      </w:pPr>
+      <w:r>
+        <w:rPr>
+          <w:sz w:val="20"/>
+          <w:szCs w:val="20"/>
+          <w:rtl w:val="0"/>
+        </w:rPr>
+        <w:t xml:space="preserve">November 2024 - Present | Wellington, New Zealand</w:t>
+      </w:r>
+    </w:p>
+    <w:p>
+      <w:pPr>
+        <w:pBdr>
+          <w:top w:color="000000" w:space="0" w:sz="0" w:val="none"/>
+          <w:bottom w:color="000000" w:space="0" w:sz="0" w:val="none"/>
+          <w:between w:color="000000" w:space="0" w:sz="0" w:val="none"/>
+        </w:pBdr>
+        <w:shd w:fill="ffffff" w:val="clear"/>
+        <w:spacing w:line="240" w:lineRule="auto"/>
+        <w:rPr>
+          <w:b w:val="1"/>
+          <w:bCs w:val="1"/>
+          <w:color w:val="4b85e8"/>
+          <w:sz w:val="20"/>
+          <w:szCs w:val="20"/>
+          <w:u w:val="single"/>
+        </w:rPr>
+      </w:pPr>
+      <w:r>
+        <w:rPr>
+          <w:b w:val="1"/>
+          <w:bCs w:val="1"/>
+          <w:color w:val="4b85e8"/>
+          <w:sz w:val="20"/>
+          <w:szCs w:val="20"/>
+          <w:u w:val="single"/>
+          <w:rtl w:val="0"/>
+        </w:rPr>
+        <w:t xml:space="preserve">www.breakpoint.co.nz</w:t>
+      </w:r>
+    </w:p>
+    <w:p>
+      <w:pPr>
+        <w:pBdr>
+          <w:top w:color="000000" w:space="0" w:sz="0" w:val="none"/>
+          <w:bottom w:color="000000" w:space="0" w:sz="0" w:val="none"/>
+          <w:between w:color="000000" w:space="0" w:sz="0" w:val="none"/>
+        </w:pBdr>
+        <w:shd w:fill="ffffff" w:val="clear"/>
+        <w:spacing w:line="240" w:lineRule="auto"/>
+        <w:rPr>
+          <w:b w:val="1"/>
+          <w:bCs w:val="1"/>
+        </w:rPr>
+      </w:pPr>
+      <w:r>
+        <w:rPr>
+          <w:rtl w:val="0"/>
+        </w:rPr>
+      </w:r>
+    </w:p>
+    <w:p>
+      <w:pPr>
+        <w:pBdr>
+          <w:top w:color="000000" w:space="0" w:sz="0" w:val="none"/>
+          <w:bottom w:color="000000" w:space="0" w:sz="0" w:val="none"/>
+          <w:between w:color="000000" w:space="0" w:sz="0" w:val="none"/>
+        </w:pBdr>
+        <w:shd w:fill="ffffff" w:val="clear"/>
+        <w:spacing w:line="240" w:lineRule="auto"/>
+        <w:rPr>
+          <w:b w:val="1"/>
+          <w:bCs w:val="1"/>
+        </w:rPr>
+      </w:pPr>
+      <w:r>
+        <w:rPr>
+          <w:sz w:val="20"/>
+          <w:szCs w:val="20"/>
+          <w:rtl w:val="0"/>
+        </w:rPr>
+        <w:t xml:space="preserve">Breakpoint specialises in enabling IT companies build up their Continuous Delivery pipelines with specific focus on Automation, Automated Testing, Performance Engineering and Application Performance Management.</w:t>
+      </w:r>
+      <w:r>
+        <w:rPr>
+          <w:rtl w:val="0"/>
+        </w:rPr>
+      </w:r>
+    </w:p>
+    <w:p>
+      <w:pPr>
+        <w:pBdr>
+          <w:top w:color="000000" w:space="0" w:sz="0" w:val="none"/>
+          <w:bottom w:color="000000" w:space="0" w:sz="0" w:val="none"/>
+          <w:between w:color="000000" w:space="0" w:sz="0" w:val="none"/>
+        </w:pBdr>
+        <w:shd w:fill="ffffff" w:val="clear"/>
+        <w:rPr>
+          <w:sz w:val="20"/>
+          <w:szCs w:val="20"/>
+        </w:rPr>
+      </w:pPr>
+      <w:r>
+        <w:rPr>
+          <w:rtl w:val="0"/>
+        </w:rPr>
+      </w:r>
+    </w:p>
+    <w:p>
+      <w:pPr>
+        <w:pBdr>
+          <w:top w:color="000000" w:space="0" w:sz="0" w:val="none"/>
+          <w:bottom w:color="000000" w:space="0" w:sz="0" w:val="none"/>
+          <w:between w:color="000000" w:space="0" w:sz="0" w:val="none"/>
+        </w:pBdr>
+        <w:jc w:val="center"/>
+        <w:rPr>
+          <w:b w:val="1"/>
+          <w:bCs w:val="1"/>
+          <w:color w:val="9e9d9d"/>
+          <w:sz w:val="11"/>
+          <w:szCs w:val="11"/>
+        </w:rPr>
+      </w:pPr>
+      <w:r>
+        <w:rPr>
+          <w:rtl w:val="0"/>
+        </w:rPr>
+      </w:r>
+    </w:p>
+    <w:p>
+      <w:pPr>
+        <w:pBdr>
+          <w:top w:color="000000" w:space="0" w:sz="0" w:val="none"/>
+          <w:bottom w:color="000000" w:space="0" w:sz="0" w:val="none"/>
+          <w:between w:color="000000" w:space="0" w:sz="0" w:val="none"/>
+        </w:pBdr>
+        <w:jc w:val="center"/>
+        <w:rPr>
+          <w:b w:val="1"/>
+          <w:bCs w:val="1"/>
+          <w:color w:val="9e9d9d"/>
+          <w:sz w:val="11"/>
+          <w:szCs w:val="11"/>
+        </w:rPr>
+      </w:pPr>
+      <w:r>
+        <w:pict>
+          <v:rect style="width:0.0pt;height:1.5pt" o:hr="t" o:hrstd="t" o:hralign="center" fillcolor="#A0A0A0" stroked="f"/>
+        </w:pict>
+      </w:r>
+      <w:r>
+        <w:rPr>
+          <w:rtl w:val="0"/>
+        </w:rPr>
+      </w:r>
+    </w:p>
+    <w:p>
+      <w:pPr>
+        <w:pBdr>
+          <w:top w:color="000000" w:space="0" w:sz="0" w:val="none"/>
+          <w:bottom w:color="000000" w:space="0" w:sz="0" w:val="none"/>
+          <w:between w:color="000000" w:space="0" w:sz="0" w:val="none"/>
+        </w:pBdr>
+        <w:shd w:fill="ffffff" w:val="clear"/>
+        <w:spacing w:line="240" w:lineRule="auto"/>
+        <w:rPr>
+          <w:sz w:val="20"/>
+          <w:szCs w:val="20"/>
         </w:rPr>
       </w:pPr>
       <w:r>

</xml_diff>